<commit_message>
Hoàn thiện backend Mức 1 + Mức 2: thống kê, TCP, bảo mật, realtime, Docker, kiểm thử tải, dữ liệu demo (B8 → 14, 20)
- B8a–e: ma trận tiến độ, thống kê bài / lớp / sinh viên, xuất bảng điểm Excel
- Bước 11: server TCP import sinh viên + client admin-cli
- Bước 12: nhật ký hệ thống, giới hạn tần suất, nginx HTTPS/WSS
- Bước 9: một tài khoản một phiên, online, tiến độ live, chat
- Bước 10: khoá lạc quan bản nháp (409 DRAFT_CONFLICT)
- Bước 13: docker-compose 5 container
- Bước 14: k6 trong Docker — 200 SV nộp sát hạn p95 9,9 ms, 0% lỗi;
  500 kết nối WebSocket, thông báo p95 228 ms (docs/09)
- Bước 20: profile demo (DemoSeeder), README, hướng dẫn Wireshark
- 468 test backend pass

Co-Authored-By: Claude Opus 5.5 <noreply@anthropic.com>
</commit_message>
<xml_diff>
--- a/docx/01-tong-quan.docx
+++ b/docx/01-tong-quan.docx
@@ -28,7 +28,7 @@
         </w:p>
       </w:sdtContent>
     </w:sdt>
-    <w:bookmarkStart w:id="35" w:name="X7245c9681f0fd9867e7dbcd9a5bfb721240fa82"/>
+    <w:bookmarkStart w:id="38" w:name="X7245c9681f0fd9867e7dbcd9a5bfb721240fa82"/>
     <w:p>
       <w:pPr>
         <w:pStyle w:val="Heading1"/>
@@ -4597,7 +4597,7 @@
     </w:p>
     <w:bookmarkEnd w:id="24"/>
     <w:bookmarkEnd w:id="25"/>
-    <w:bookmarkStart w:id="26" w:name="X4c3f3b6edb8f2a69d7cb2d70d01430b1d926638"/>
+    <w:bookmarkStart w:id="27" w:name="X4c3f3b6edb8f2a69d7cb2d70d01430b1d926638"/>
     <w:p>
       <w:pPr>
         <w:pStyle w:val="Heading2"/>
@@ -4732,6 +4732,23 @@
               </w:rPr>
               <w:t xml:space="preserve">loadtest/submit-rush.js</w:t>
             </w:r>
+            <w:r>
+              <w:t xml:space="preserve"> </w:t>
+            </w:r>
+            <w:r>
+              <w:t xml:space="preserve">— đạt, p95 9,9 ms, 0% lỗi (</w:t>
+            </w:r>
+            <w:hyperlink r:id="rId26">
+              <w:r>
+                <w:rPr>
+                  <w:rStyle w:val="Hyperlink"/>
+                </w:rPr>
+                <w:t xml:space="preserve">09</w:t>
+              </w:r>
+            </w:hyperlink>
+            <w:r>
+              <w:t xml:space="preserve">)</w:t>
+            </w:r>
           </w:p>
         </w:tc>
       </w:tr>
@@ -4792,7 +4809,33 @@
               <w:pStyle w:val="Compact"/>
             </w:pPr>
             <w:r>
-              <w:t xml:space="preserve">k6 + số liệu Actuator</w:t>
+              <w:t xml:space="preserve">Script k6</w:t>
+            </w:r>
+            <w:r>
+              <w:t xml:space="preserve"> </w:t>
+            </w:r>
+            <w:r>
+              <w:rPr>
+                <w:rStyle w:val="VerbatimChar"/>
+              </w:rPr>
+              <w:t xml:space="preserve">loadtest/ws-connections.js</w:t>
+            </w:r>
+            <w:r>
+              <w:t xml:space="preserve"> </w:t>
+            </w:r>
+            <w:r>
+              <w:t xml:space="preserve">— đạt, 500 / 500 (</w:t>
+            </w:r>
+            <w:hyperlink r:id="rId26">
+              <w:r>
+                <w:rPr>
+                  <w:rStyle w:val="Hyperlink"/>
+                </w:rPr>
+                <w:t xml:space="preserve">09</w:t>
+              </w:r>
+            </w:hyperlink>
+            <w:r>
+              <w:t xml:space="preserve">)</w:t>
             </w:r>
           </w:p>
         </w:tc>
@@ -4854,7 +4897,42 @@
               <w:pStyle w:val="Compact"/>
             </w:pPr>
             <w:r>
-              <w:t xml:space="preserve">Đo thời gian trong log</w:t>
+              <w:rPr>
+                <w:rStyle w:val="VerbatimChar"/>
+              </w:rPr>
+              <w:t xml:space="preserve">ws-connections.js</w:t>
+            </w:r>
+            <w:r>
+              <w:t xml:space="preserve"> </w:t>
+            </w:r>
+            <w:r>
+              <w:t xml:space="preserve">đo giờ nhận −</w:t>
+            </w:r>
+            <w:r>
+              <w:t xml:space="preserve"> </w:t>
+            </w:r>
+            <w:r>
+              <w:rPr>
+                <w:rStyle w:val="VerbatimChar"/>
+              </w:rPr>
+              <w:t xml:space="preserve">createdAt</w:t>
+            </w:r>
+            <w:r>
+              <w:t xml:space="preserve"> </w:t>
+            </w:r>
+            <w:r>
+              <w:t xml:space="preserve">— đạt, p95 228 ms (</w:t>
+            </w:r>
+            <w:hyperlink r:id="rId26">
+              <w:r>
+                <w:rPr>
+                  <w:rStyle w:val="Hyperlink"/>
+                </w:rPr>
+                <w:t xml:space="preserve">09</w:t>
+              </w:r>
+            </w:hyperlink>
+            <w:r>
+              <w:t xml:space="preserve">)</w:t>
             </w:r>
           </w:p>
         </w:tc>
@@ -5457,8 +5535,8 @@
         </w:pict>
       </w:r>
     </w:p>
-    <w:bookmarkEnd w:id="26"/>
-    <w:bookmarkStart w:id="28" w:name="Xc9033a980d0e4ab66189c83298bb25e4e69e79c"/>
+    <w:bookmarkEnd w:id="27"/>
+    <w:bookmarkStart w:id="29" w:name="Xc9033a980d0e4ab66189c83298bb25e4e69e79c"/>
     <w:p>
       <w:pPr>
         <w:pStyle w:val="Heading2"/>
@@ -6013,7 +6091,7 @@
             <w:r>
               <w:t xml:space="preserve"> </w:t>
             </w:r>
-            <w:hyperlink r:id="rId27">
+            <w:hyperlink r:id="rId28">
               <w:r>
                 <w:rPr>
                   <w:rStyle w:val="Hyperlink"/>
@@ -6408,8 +6486,8 @@
         </w:pict>
       </w:r>
     </w:p>
-    <w:bookmarkEnd w:id="28"/>
-    <w:bookmarkStart w:id="32" w:name="X271c70a0668e3cc8ca8b62669a7dc58412e05c6"/>
+    <w:bookmarkEnd w:id="29"/>
+    <w:bookmarkStart w:id="35" w:name="X271c70a0668e3cc8ca8b62669a7dc58412e05c6"/>
     <w:p>
       <w:pPr>
         <w:pStyle w:val="Heading2"/>
@@ -6427,18 +6505,18 @@
           <wp:inline>
             <wp:extent cx="5334000" cy="3286125"/>
             <wp:effectExtent b="0" l="0" r="0" t="0"/>
-            <wp:docPr descr="Hình 01.1" title="" id="30" name="Picture"/>
+            <wp:docPr descr="Hình 01.1" title="" id="31" name="Picture"/>
             <a:graphic>
               <a:graphicData uri="http://schemas.openxmlformats.org/drawingml/2006/picture">
                 <pic:pic>
                   <pic:nvPicPr>
-                    <pic:cNvPr descr="D:/LTMTU/docx/hinh/01-tong-quan-hinh-1.png" id="31" name="Picture"/>
+                    <pic:cNvPr descr="D:/LTMTU/docx/hinh/01-tong-quan-hinh-1.png" id="32" name="Picture"/>
                     <pic:cNvPicPr>
                       <a:picLocks noChangeArrowheads="1" noChangeAspect="1"/>
                     </pic:cNvPicPr>
                   </pic:nvPicPr>
                   <pic:blipFill>
-                    <a:blip r:embed="rId29"/>
+                    <a:blip r:embed="rId30"/>
                     <a:stretch>
                       <a:fillRect/>
                     </a:stretch>
@@ -6639,14 +6717,254 @@
       </w:r>
     </w:p>
     <w:p>
+      <w:pPr>
+        <w:pStyle w:val="FirstParagraph"/>
+      </w:pPr>
+      <w:r>
+        <w:rPr>
+          <w:b/>
+          <w:bCs/>
+        </w:rPr>
+        <w:t xml:space="preserve">Triển khai (đã cài ở bước 13):</w:t>
+      </w:r>
+      <w:r>
+        <w:t xml:space="preserve"> </w:t>
+      </w:r>
+      <w:r>
+        <w:rPr>
+          <w:rStyle w:val="VerbatimChar"/>
+        </w:rPr>
+        <w:t xml:space="preserve">docker-compose.yml</w:t>
+      </w:r>
+      <w:r>
+        <w:t xml:space="preserve"> </w:t>
+      </w:r>
+      <w:r>
+        <w:t xml:space="preserve">ở thư mục gốc dựng 5 container —</w:t>
+      </w:r>
+      <w:r>
+        <w:t xml:space="preserve"> </w:t>
+      </w:r>
+      <w:r>
+        <w:rPr>
+          <w:rStyle w:val="VerbatimChar"/>
+        </w:rPr>
+        <w:t xml:space="preserve">postgres</w:t>
+      </w:r>
+      <w:r>
+        <w:t xml:space="preserve"> </w:t>
+      </w:r>
+      <w:r>
+        <w:t xml:space="preserve">(18),</w:t>
+      </w:r>
+      <w:r>
+        <w:t xml:space="preserve"> </w:t>
+      </w:r>
+      <w:r>
+        <w:rPr>
+          <w:rStyle w:val="VerbatimChar"/>
+        </w:rPr>
+        <w:t xml:space="preserve">mailpit</w:t>
+      </w:r>
+      <w:r>
+        <w:t xml:space="preserve">,</w:t>
+      </w:r>
+      <w:r>
+        <w:t xml:space="preserve"> </w:t>
+      </w:r>
+      <w:r>
+        <w:rPr>
+          <w:rStyle w:val="VerbatimChar"/>
+        </w:rPr>
+        <w:t xml:space="preserve">backend</w:t>
+      </w:r>
+      <w:r>
+        <w:t xml:space="preserve"> </w:t>
+      </w:r>
+      <w:r>
+        <w:t xml:space="preserve">(profile</w:t>
+      </w:r>
+      <w:r>
+        <w:t xml:space="preserve"> </w:t>
+      </w:r>
+      <w:r>
+        <w:rPr>
+          <w:rStyle w:val="VerbatimChar"/>
+        </w:rPr>
+        <w:t xml:space="preserve">docker</w:t>
+      </w:r>
+      <w:r>
+        <w:t xml:space="preserve">),</w:t>
+      </w:r>
+      <w:r>
+        <w:t xml:space="preserve"> </w:t>
+      </w:r>
+      <w:r>
+        <w:rPr>
+          <w:rStyle w:val="VerbatimChar"/>
+        </w:rPr>
+        <w:t xml:space="preserve">frontend</w:t>
+      </w:r>
+      <w:r>
+        <w:t xml:space="preserve">,</w:t>
+      </w:r>
+      <w:r>
+        <w:t xml:space="preserve"> </w:t>
+      </w:r>
+      <w:r>
+        <w:rPr>
+          <w:rStyle w:val="VerbatimChar"/>
+        </w:rPr>
+        <w:t xml:space="preserve">nginx</w:t>
+      </w:r>
+      <w:r>
+        <w:t xml:space="preserve"> </w:t>
+      </w:r>
+      <w:r>
+        <w:t xml:space="preserve">(1.27). Chỉ mở ra máy chủ: 80 / 443 (nginx), 9090 (TCP cho</w:t>
+      </w:r>
+      <w:r>
+        <w:t xml:space="preserve"> </w:t>
+      </w:r>
+      <w:r>
+        <w:rPr>
+          <w:rStyle w:val="VerbatimChar"/>
+        </w:rPr>
+        <w:t xml:space="preserve">admin-cli</w:t>
+      </w:r>
+      <w:r>
+        <w:t xml:space="preserve">), 8025 (giao diện Mailpit); backend 8080 và PostgreSQL chỉ nằm trong mạng nội bộ của Docker, nên header</w:t>
+      </w:r>
+      <w:r>
+        <w:t xml:space="preserve"> </w:t>
+      </w:r>
+      <w:r>
+        <w:rPr>
+          <w:rStyle w:val="VerbatimChar"/>
+        </w:rPr>
+        <w:t xml:space="preserve">X-Forwarded-For</w:t>
+      </w:r>
+      <w:r>
+        <w:t xml:space="preserve"> </w:t>
+      </w:r>
+      <w:r>
+        <w:t xml:space="preserve">chỉ nginx đặt được và backend tin header này để lấy IP thật (nhật ký, giới hạn đăng nhập sai). Dữ liệu nằm trong volume</w:t>
+      </w:r>
+      <w:r>
+        <w:t xml:space="preserve"> </w:t>
+      </w:r>
+      <w:r>
+        <w:rPr>
+          <w:rStyle w:val="VerbatimChar"/>
+        </w:rPr>
+        <w:t xml:space="preserve">pgdata</w:t>
+      </w:r>
+      <w:r>
+        <w:t xml:space="preserve">,</w:t>
+      </w:r>
+      <w:r>
+        <w:t xml:space="preserve"> </w:t>
+      </w:r>
+      <w:r>
+        <w:rPr>
+          <w:rStyle w:val="VerbatimChar"/>
+        </w:rPr>
+        <w:t xml:space="preserve">uploads</w:t>
+      </w:r>
+      <w:r>
+        <w:t xml:space="preserve">. Hướng dẫn chạy:</w:t>
+      </w:r>
+      <w:r>
+        <w:t xml:space="preserve"> </w:t>
+      </w:r>
+      <w:hyperlink r:id="rId33">
+        <w:r>
+          <w:rPr>
+            <w:rStyle w:val="VerbatimChar"/>
+          </w:rPr>
+          <w:t xml:space="preserve">deploy/README.md</w:t>
+        </w:r>
+      </w:hyperlink>
+      <w:r>
+        <w:t xml:space="preserve">. Thêm profile</w:t>
+      </w:r>
+      <w:r>
+        <w:t xml:space="preserve"> </w:t>
+      </w:r>
+      <w:r>
+        <w:rPr>
+          <w:rStyle w:val="VerbatimChar"/>
+        </w:rPr>
+        <w:t xml:space="preserve">demo</w:t>
+      </w:r>
+      <w:r>
+        <w:t xml:space="preserve"> </w:t>
+      </w:r>
+      <w:r>
+        <w:t xml:space="preserve">(</w:t>
+      </w:r>
+      <w:r>
+        <w:rPr>
+          <w:rStyle w:val="VerbatimChar"/>
+        </w:rPr>
+        <w:t xml:space="preserve">SPRING_PROFILES_ACTIVE=docker,demo</w:t>
+      </w:r>
+      <w:r>
+        <w:t xml:space="preserve">) thì backend nạp sẵn dữ liệu mẫu cho buổi demo (bước 20,</w:t>
+      </w:r>
+      <w:r>
+        <w:t xml:space="preserve"> </w:t>
+      </w:r>
+      <w:hyperlink r:id="rId34">
+        <w:r>
+          <w:rPr>
+            <w:rStyle w:val="VerbatimChar"/>
+          </w:rPr>
+          <w:t xml:space="preserve">README</w:t>
+        </w:r>
+      </w:hyperlink>
+      <w:r>
+        <w:t xml:space="preserve">); ghép thêm</w:t>
+      </w:r>
+      <w:r>
+        <w:t xml:space="preserve"> </w:t>
+      </w:r>
+      <w:r>
+        <w:rPr>
+          <w:rStyle w:val="VerbatimChar"/>
+        </w:rPr>
+        <w:t xml:space="preserve">loadtest/compose.loadtest.yml</w:t>
+      </w:r>
+      <w:r>
+        <w:t xml:space="preserve"> </w:t>
+      </w:r>
+      <w:r>
+        <w:t xml:space="preserve">để kiểm thử tải bằng k6 (bước 14,</w:t>
+      </w:r>
+      <w:r>
+        <w:t xml:space="preserve"> </w:t>
+      </w:r>
+      <w:hyperlink r:id="rId26">
+        <w:r>
+          <w:rPr>
+            <w:rStyle w:val="Hyperlink"/>
+          </w:rPr>
+          <w:t xml:space="preserve">09-kiem-thu-tai.md</w:t>
+        </w:r>
+      </w:hyperlink>
+      <w:r>
+        <w:t xml:space="preserve">).</w:t>
+      </w:r>
+    </w:p>
+    <w:p>
       <w:r>
         <w:pict>
           <v:rect style="width:0;height:1.5pt" o:hralign="center" o:hrstd="t" o:hr="t"/>
         </w:pict>
       </w:r>
     </w:p>
-    <w:bookmarkEnd w:id="32"/>
-    <w:bookmarkStart w:id="33" w:name="Xfe32609f4716a5a0e160829cacc783e5631e738"/>
+    <w:bookmarkEnd w:id="35"/>
+    <w:bookmarkStart w:id="36" w:name="Xfe32609f4716a5a0e160829cacc783e5631e738"/>
     <w:p>
       <w:pPr>
         <w:pStyle w:val="Heading2"/>
@@ -6849,7 +7167,7 @@
               <w:pStyle w:val="Compact"/>
             </w:pPr>
             <w:r>
-              <w:t xml:space="preserve">PostgreSQL 16</w:t>
+              <w:t xml:space="preserve">PostgreSQL 18</w:t>
             </w:r>
           </w:p>
         </w:tc>
@@ -6910,8 +7228,8 @@
         </w:pict>
       </w:r>
     </w:p>
-    <w:bookmarkEnd w:id="33"/>
-    <w:bookmarkStart w:id="34" w:name="X0e7478702f5df70d76349c9562db5ccd7409e48"/>
+    <w:bookmarkEnd w:id="36"/>
+    <w:bookmarkStart w:id="37" w:name="X0e7478702f5df70d76349c9562db5ccd7409e48"/>
     <w:p>
       <w:pPr>
         <w:pStyle w:val="Heading2"/>
@@ -7366,8 +7684,8 @@
         </w:tc>
       </w:tr>
     </w:tbl>
-    <w:bookmarkEnd w:id="34"/>
-    <w:bookmarkEnd w:id="35"/>
+    <w:bookmarkEnd w:id="37"/>
+    <w:bookmarkEnd w:id="38"/>
     <w:sectPr>
       <w:footnotePr>
         <w:numRestart w:val="eachSect"/>

</xml_diff>

<commit_message>
Module lớp học và nhập sinh viên: import qua TCP (server TCP, FrameReader, admin-cli) và qua web, báo lỗi từng dòng
</commit_message>
<xml_diff>
--- a/docx/01-tong-quan.docx
+++ b/docx/01-tong-quan.docx
@@ -28,7 +28,7 @@
         </w:p>
       </w:sdtContent>
     </w:sdt>
-    <w:bookmarkStart w:id="35" w:name="X7245c9681f0fd9867e7dbcd9a5bfb721240fa82"/>
+    <w:bookmarkStart w:id="38" w:name="X7245c9681f0fd9867e7dbcd9a5bfb721240fa82"/>
     <w:p>
       <w:pPr>
         <w:pStyle w:val="Heading1"/>
@@ -4597,7 +4597,7 @@
     </w:p>
     <w:bookmarkEnd w:id="24"/>
     <w:bookmarkEnd w:id="25"/>
-    <w:bookmarkStart w:id="26" w:name="X4c3f3b6edb8f2a69d7cb2d70d01430b1d926638"/>
+    <w:bookmarkStart w:id="27" w:name="X4c3f3b6edb8f2a69d7cb2d70d01430b1d926638"/>
     <w:p>
       <w:pPr>
         <w:pStyle w:val="Heading2"/>
@@ -4732,6 +4732,23 @@
               </w:rPr>
               <w:t xml:space="preserve">loadtest/submit-rush.js</w:t>
             </w:r>
+            <w:r>
+              <w:t xml:space="preserve"> </w:t>
+            </w:r>
+            <w:r>
+              <w:t xml:space="preserve">— đạt, p95 9,9 ms, 0% lỗi (</w:t>
+            </w:r>
+            <w:hyperlink r:id="rId26">
+              <w:r>
+                <w:rPr>
+                  <w:rStyle w:val="Hyperlink"/>
+                </w:rPr>
+                <w:t xml:space="preserve">09</w:t>
+              </w:r>
+            </w:hyperlink>
+            <w:r>
+              <w:t xml:space="preserve">)</w:t>
+            </w:r>
           </w:p>
         </w:tc>
       </w:tr>
@@ -4792,7 +4809,33 @@
               <w:pStyle w:val="Compact"/>
             </w:pPr>
             <w:r>
-              <w:t xml:space="preserve">k6 + số liệu Actuator</w:t>
+              <w:t xml:space="preserve">Script k6</w:t>
+            </w:r>
+            <w:r>
+              <w:t xml:space="preserve"> </w:t>
+            </w:r>
+            <w:r>
+              <w:rPr>
+                <w:rStyle w:val="VerbatimChar"/>
+              </w:rPr>
+              <w:t xml:space="preserve">loadtest/ws-connections.js</w:t>
+            </w:r>
+            <w:r>
+              <w:t xml:space="preserve"> </w:t>
+            </w:r>
+            <w:r>
+              <w:t xml:space="preserve">— đạt, 500 / 500 (</w:t>
+            </w:r>
+            <w:hyperlink r:id="rId26">
+              <w:r>
+                <w:rPr>
+                  <w:rStyle w:val="Hyperlink"/>
+                </w:rPr>
+                <w:t xml:space="preserve">09</w:t>
+              </w:r>
+            </w:hyperlink>
+            <w:r>
+              <w:t xml:space="preserve">)</w:t>
             </w:r>
           </w:p>
         </w:tc>
@@ -4854,7 +4897,42 @@
               <w:pStyle w:val="Compact"/>
             </w:pPr>
             <w:r>
-              <w:t xml:space="preserve">Đo thời gian trong log</w:t>
+              <w:rPr>
+                <w:rStyle w:val="VerbatimChar"/>
+              </w:rPr>
+              <w:t xml:space="preserve">ws-connections.js</w:t>
+            </w:r>
+            <w:r>
+              <w:t xml:space="preserve"> </w:t>
+            </w:r>
+            <w:r>
+              <w:t xml:space="preserve">đo giờ nhận −</w:t>
+            </w:r>
+            <w:r>
+              <w:t xml:space="preserve"> </w:t>
+            </w:r>
+            <w:r>
+              <w:rPr>
+                <w:rStyle w:val="VerbatimChar"/>
+              </w:rPr>
+              <w:t xml:space="preserve">createdAt</w:t>
+            </w:r>
+            <w:r>
+              <w:t xml:space="preserve"> </w:t>
+            </w:r>
+            <w:r>
+              <w:t xml:space="preserve">— đạt, p95 228 ms (</w:t>
+            </w:r>
+            <w:hyperlink r:id="rId26">
+              <w:r>
+                <w:rPr>
+                  <w:rStyle w:val="Hyperlink"/>
+                </w:rPr>
+                <w:t xml:space="preserve">09</w:t>
+              </w:r>
+            </w:hyperlink>
+            <w:r>
+              <w:t xml:space="preserve">)</w:t>
             </w:r>
           </w:p>
         </w:tc>
@@ -5457,8 +5535,8 @@
         </w:pict>
       </w:r>
     </w:p>
-    <w:bookmarkEnd w:id="26"/>
-    <w:bookmarkStart w:id="28" w:name="Xc9033a980d0e4ab66189c83298bb25e4e69e79c"/>
+    <w:bookmarkEnd w:id="27"/>
+    <w:bookmarkStart w:id="29" w:name="Xc9033a980d0e4ab66189c83298bb25e4e69e79c"/>
     <w:p>
       <w:pPr>
         <w:pStyle w:val="Heading2"/>
@@ -6013,7 +6091,7 @@
             <w:r>
               <w:t xml:space="preserve"> </w:t>
             </w:r>
-            <w:hyperlink r:id="rId27">
+            <w:hyperlink r:id="rId28">
               <w:r>
                 <w:rPr>
                   <w:rStyle w:val="Hyperlink"/>
@@ -6408,8 +6486,8 @@
         </w:pict>
       </w:r>
     </w:p>
-    <w:bookmarkEnd w:id="28"/>
-    <w:bookmarkStart w:id="32" w:name="X271c70a0668e3cc8ca8b62669a7dc58412e05c6"/>
+    <w:bookmarkEnd w:id="29"/>
+    <w:bookmarkStart w:id="35" w:name="X271c70a0668e3cc8ca8b62669a7dc58412e05c6"/>
     <w:p>
       <w:pPr>
         <w:pStyle w:val="Heading2"/>
@@ -6427,18 +6505,18 @@
           <wp:inline>
             <wp:extent cx="5334000" cy="3286125"/>
             <wp:effectExtent b="0" l="0" r="0" t="0"/>
-            <wp:docPr descr="Hình 01.1" title="" id="30" name="Picture"/>
+            <wp:docPr descr="Hình 01.1" title="" id="31" name="Picture"/>
             <a:graphic>
               <a:graphicData uri="http://schemas.openxmlformats.org/drawingml/2006/picture">
                 <pic:pic>
                   <pic:nvPicPr>
-                    <pic:cNvPr descr="D:/LTMTU/docx/hinh/01-tong-quan-hinh-1.png" id="31" name="Picture"/>
+                    <pic:cNvPr descr="D:/LTMTU/docx/hinh/01-tong-quan-hinh-1.png" id="32" name="Picture"/>
                     <pic:cNvPicPr>
                       <a:picLocks noChangeArrowheads="1" noChangeAspect="1"/>
                     </pic:cNvPicPr>
                   </pic:nvPicPr>
                   <pic:blipFill>
-                    <a:blip r:embed="rId29"/>
+                    <a:blip r:embed="rId30"/>
                     <a:stretch>
                       <a:fillRect/>
                     </a:stretch>
@@ -6639,14 +6717,254 @@
       </w:r>
     </w:p>
     <w:p>
+      <w:pPr>
+        <w:pStyle w:val="FirstParagraph"/>
+      </w:pPr>
+      <w:r>
+        <w:rPr>
+          <w:b/>
+          <w:bCs/>
+        </w:rPr>
+        <w:t xml:space="preserve">Triển khai (đã cài ở bước 13):</w:t>
+      </w:r>
+      <w:r>
+        <w:t xml:space="preserve"> </w:t>
+      </w:r>
+      <w:r>
+        <w:rPr>
+          <w:rStyle w:val="VerbatimChar"/>
+        </w:rPr>
+        <w:t xml:space="preserve">docker-compose.yml</w:t>
+      </w:r>
+      <w:r>
+        <w:t xml:space="preserve"> </w:t>
+      </w:r>
+      <w:r>
+        <w:t xml:space="preserve">ở thư mục gốc dựng 5 container —</w:t>
+      </w:r>
+      <w:r>
+        <w:t xml:space="preserve"> </w:t>
+      </w:r>
+      <w:r>
+        <w:rPr>
+          <w:rStyle w:val="VerbatimChar"/>
+        </w:rPr>
+        <w:t xml:space="preserve">postgres</w:t>
+      </w:r>
+      <w:r>
+        <w:t xml:space="preserve"> </w:t>
+      </w:r>
+      <w:r>
+        <w:t xml:space="preserve">(18),</w:t>
+      </w:r>
+      <w:r>
+        <w:t xml:space="preserve"> </w:t>
+      </w:r>
+      <w:r>
+        <w:rPr>
+          <w:rStyle w:val="VerbatimChar"/>
+        </w:rPr>
+        <w:t xml:space="preserve">mailpit</w:t>
+      </w:r>
+      <w:r>
+        <w:t xml:space="preserve">,</w:t>
+      </w:r>
+      <w:r>
+        <w:t xml:space="preserve"> </w:t>
+      </w:r>
+      <w:r>
+        <w:rPr>
+          <w:rStyle w:val="VerbatimChar"/>
+        </w:rPr>
+        <w:t xml:space="preserve">backend</w:t>
+      </w:r>
+      <w:r>
+        <w:t xml:space="preserve"> </w:t>
+      </w:r>
+      <w:r>
+        <w:t xml:space="preserve">(profile</w:t>
+      </w:r>
+      <w:r>
+        <w:t xml:space="preserve"> </w:t>
+      </w:r>
+      <w:r>
+        <w:rPr>
+          <w:rStyle w:val="VerbatimChar"/>
+        </w:rPr>
+        <w:t xml:space="preserve">docker</w:t>
+      </w:r>
+      <w:r>
+        <w:t xml:space="preserve">),</w:t>
+      </w:r>
+      <w:r>
+        <w:t xml:space="preserve"> </w:t>
+      </w:r>
+      <w:r>
+        <w:rPr>
+          <w:rStyle w:val="VerbatimChar"/>
+        </w:rPr>
+        <w:t xml:space="preserve">frontend</w:t>
+      </w:r>
+      <w:r>
+        <w:t xml:space="preserve">,</w:t>
+      </w:r>
+      <w:r>
+        <w:t xml:space="preserve"> </w:t>
+      </w:r>
+      <w:r>
+        <w:rPr>
+          <w:rStyle w:val="VerbatimChar"/>
+        </w:rPr>
+        <w:t xml:space="preserve">nginx</w:t>
+      </w:r>
+      <w:r>
+        <w:t xml:space="preserve"> </w:t>
+      </w:r>
+      <w:r>
+        <w:t xml:space="preserve">(1.27). Chỉ mở ra máy chủ: 80 / 443 (nginx), 9090 (TCP cho</w:t>
+      </w:r>
+      <w:r>
+        <w:t xml:space="preserve"> </w:t>
+      </w:r>
+      <w:r>
+        <w:rPr>
+          <w:rStyle w:val="VerbatimChar"/>
+        </w:rPr>
+        <w:t xml:space="preserve">admin-cli</w:t>
+      </w:r>
+      <w:r>
+        <w:t xml:space="preserve">), 8025 (giao diện Mailpit); backend 8080 và PostgreSQL chỉ nằm trong mạng nội bộ của Docker, nên header</w:t>
+      </w:r>
+      <w:r>
+        <w:t xml:space="preserve"> </w:t>
+      </w:r>
+      <w:r>
+        <w:rPr>
+          <w:rStyle w:val="VerbatimChar"/>
+        </w:rPr>
+        <w:t xml:space="preserve">X-Forwarded-For</w:t>
+      </w:r>
+      <w:r>
+        <w:t xml:space="preserve"> </w:t>
+      </w:r>
+      <w:r>
+        <w:t xml:space="preserve">chỉ nginx đặt được và backend tin header này để lấy IP thật (nhật ký, giới hạn đăng nhập sai). Dữ liệu nằm trong volume</w:t>
+      </w:r>
+      <w:r>
+        <w:t xml:space="preserve"> </w:t>
+      </w:r>
+      <w:r>
+        <w:rPr>
+          <w:rStyle w:val="VerbatimChar"/>
+        </w:rPr>
+        <w:t xml:space="preserve">pgdata</w:t>
+      </w:r>
+      <w:r>
+        <w:t xml:space="preserve">,</w:t>
+      </w:r>
+      <w:r>
+        <w:t xml:space="preserve"> </w:t>
+      </w:r>
+      <w:r>
+        <w:rPr>
+          <w:rStyle w:val="VerbatimChar"/>
+        </w:rPr>
+        <w:t xml:space="preserve">uploads</w:t>
+      </w:r>
+      <w:r>
+        <w:t xml:space="preserve">. Hướng dẫn chạy:</w:t>
+      </w:r>
+      <w:r>
+        <w:t xml:space="preserve"> </w:t>
+      </w:r>
+      <w:hyperlink r:id="rId33">
+        <w:r>
+          <w:rPr>
+            <w:rStyle w:val="VerbatimChar"/>
+          </w:rPr>
+          <w:t xml:space="preserve">deploy/README.md</w:t>
+        </w:r>
+      </w:hyperlink>
+      <w:r>
+        <w:t xml:space="preserve">. Thêm profile</w:t>
+      </w:r>
+      <w:r>
+        <w:t xml:space="preserve"> </w:t>
+      </w:r>
+      <w:r>
+        <w:rPr>
+          <w:rStyle w:val="VerbatimChar"/>
+        </w:rPr>
+        <w:t xml:space="preserve">demo</w:t>
+      </w:r>
+      <w:r>
+        <w:t xml:space="preserve"> </w:t>
+      </w:r>
+      <w:r>
+        <w:t xml:space="preserve">(</w:t>
+      </w:r>
+      <w:r>
+        <w:rPr>
+          <w:rStyle w:val="VerbatimChar"/>
+        </w:rPr>
+        <w:t xml:space="preserve">SPRING_PROFILES_ACTIVE=docker,demo</w:t>
+      </w:r>
+      <w:r>
+        <w:t xml:space="preserve">) thì backend nạp sẵn dữ liệu mẫu cho buổi demo (bước 20,</w:t>
+      </w:r>
+      <w:r>
+        <w:t xml:space="preserve"> </w:t>
+      </w:r>
+      <w:hyperlink r:id="rId34">
+        <w:r>
+          <w:rPr>
+            <w:rStyle w:val="VerbatimChar"/>
+          </w:rPr>
+          <w:t xml:space="preserve">README</w:t>
+        </w:r>
+      </w:hyperlink>
+      <w:r>
+        <w:t xml:space="preserve">); ghép thêm</w:t>
+      </w:r>
+      <w:r>
+        <w:t xml:space="preserve"> </w:t>
+      </w:r>
+      <w:r>
+        <w:rPr>
+          <w:rStyle w:val="VerbatimChar"/>
+        </w:rPr>
+        <w:t xml:space="preserve">loadtest/compose.loadtest.yml</w:t>
+      </w:r>
+      <w:r>
+        <w:t xml:space="preserve"> </w:t>
+      </w:r>
+      <w:r>
+        <w:t xml:space="preserve">để kiểm thử tải bằng k6 (bước 14,</w:t>
+      </w:r>
+      <w:r>
+        <w:t xml:space="preserve"> </w:t>
+      </w:r>
+      <w:hyperlink r:id="rId26">
+        <w:r>
+          <w:rPr>
+            <w:rStyle w:val="Hyperlink"/>
+          </w:rPr>
+          <w:t xml:space="preserve">09-kiem-thu-tai.md</w:t>
+        </w:r>
+      </w:hyperlink>
+      <w:r>
+        <w:t xml:space="preserve">).</w:t>
+      </w:r>
+    </w:p>
+    <w:p>
       <w:r>
         <w:pict>
           <v:rect style="width:0;height:1.5pt" o:hralign="center" o:hrstd="t" o:hr="t"/>
         </w:pict>
       </w:r>
     </w:p>
-    <w:bookmarkEnd w:id="32"/>
-    <w:bookmarkStart w:id="33" w:name="Xfe32609f4716a5a0e160829cacc783e5631e738"/>
+    <w:bookmarkEnd w:id="35"/>
+    <w:bookmarkStart w:id="36" w:name="Xfe32609f4716a5a0e160829cacc783e5631e738"/>
     <w:p>
       <w:pPr>
         <w:pStyle w:val="Heading2"/>
@@ -6849,7 +7167,7 @@
               <w:pStyle w:val="Compact"/>
             </w:pPr>
             <w:r>
-              <w:t xml:space="preserve">PostgreSQL 16</w:t>
+              <w:t xml:space="preserve">PostgreSQL 18</w:t>
             </w:r>
           </w:p>
         </w:tc>
@@ -6910,8 +7228,8 @@
         </w:pict>
       </w:r>
     </w:p>
-    <w:bookmarkEnd w:id="33"/>
-    <w:bookmarkStart w:id="34" w:name="X0e7478702f5df70d76349c9562db5ccd7409e48"/>
+    <w:bookmarkEnd w:id="36"/>
+    <w:bookmarkStart w:id="37" w:name="X0e7478702f5df70d76349c9562db5ccd7409e48"/>
     <w:p>
       <w:pPr>
         <w:pStyle w:val="Heading2"/>
@@ -7366,8 +7684,8 @@
         </w:tc>
       </w:tr>
     </w:tbl>
-    <w:bookmarkEnd w:id="34"/>
-    <w:bookmarkEnd w:id="35"/>
+    <w:bookmarkEnd w:id="37"/>
+    <w:bookmarkEnd w:id="38"/>
     <w:sectPr>
       <w:footnotePr>
         <w:numRestart w:val="eachSect"/>

</xml_diff>

<commit_message>
Module paper theo nhóm: soạn cộng tác bằng Yjs, cấp số thứ tự bản cập nhật, snapshot tài liệu
</commit_message>
<xml_diff>
--- a/docx/01-tong-quan.docx
+++ b/docx/01-tong-quan.docx
@@ -28,7 +28,7 @@
         </w:p>
       </w:sdtContent>
     </w:sdt>
-    <w:bookmarkStart w:id="38" w:name="X7245c9681f0fd9867e7dbcd9a5bfb721240fa82"/>
+    <w:bookmarkStart w:id="40" w:name="X7245c9681f0fd9867e7dbcd9a5bfb721240fa82"/>
     <w:p>
       <w:pPr>
         <w:pStyle w:val="Heading1"/>
@@ -1208,7 +1208,7 @@
       </w:r>
     </w:p>
     <w:bookmarkEnd w:id="16"/>
-    <w:bookmarkStart w:id="25" w:name="Xea9ee2abb1d9c3f9610db3a634986f9b148ce56"/>
+    <w:bookmarkStart w:id="27" w:name="Xea9ee2abb1d9c3f9610db3a634986f9b148ce56"/>
     <w:p>
       <w:pPr>
         <w:pStyle w:val="Heading2"/>
@@ -2634,7 +2634,23 @@
               <w:pStyle w:val="Compact"/>
             </w:pPr>
             <w:r>
-              <w:t xml:space="preserve">Chế độ thi tính giờ: hết giờ server tự nộp; ghi nhận chuyển tab, dán văn bản, mất kết nối</w:t>
+              <w:t xml:space="preserve">Chế độ thi tính giờ: hết giờ thì gắn</w:t>
+            </w:r>
+            <w:r>
+              <w:t xml:space="preserve"> </w:t>
+            </w:r>
+            <w:r>
+              <w:rPr>
+                <w:b/>
+                <w:bCs/>
+              </w:rPr>
+              <w:t xml:space="preserve">quá thời gian</w:t>
+            </w:r>
+            <w:r>
+              <w:t xml:space="preserve"> </w:t>
+            </w:r>
+            <w:r>
+              <w:t xml:space="preserve">và báo giáo viên + sinh viên (không tự nộp); ghi nhận chuyển tab, dán văn bản, mất kết nối, hiện ngay trên màn giám sát và báo giáo viên</w:t>
             </w:r>
           </w:p>
         </w:tc>
@@ -4588,22 +4604,28 @@
         </w:tc>
       </w:tr>
     </w:tbl>
-    <w:p>
-      <w:r>
-        <w:pict>
-          <v:rect style="width:0;height:1.5pt" o:hralign="center" o:hrstd="t" o:hr="t"/>
-        </w:pict>
-      </w:r>
-    </w:p>
     <w:bookmarkEnd w:id="24"/>
-    <w:bookmarkEnd w:id="25"/>
-    <w:bookmarkStart w:id="27" w:name="X4c3f3b6edb8f2a69d7cb2d70d01430b1d926638"/>
+    <w:bookmarkStart w:id="26" w:name="Xb667374215cf5e933e1df4d05020639d0e97fcd"/>
     <w:p>
       <w:pPr>
-        <w:pStyle w:val="Heading2"/>
+        <w:pStyle w:val="Heading3"/>
       </w:pPr>
       <w:r>
-        <w:t xml:space="preserve">5. Yêu cầu phi chức năng</w:t>
+        <w:t xml:space="preserve">4.8 Paper học thuật theo nhóm (Mức 4 — thiết kế đầy đủ ở</w:t>
+      </w:r>
+      <w:r>
+        <w:t xml:space="preserve"> </w:t>
+      </w:r>
+      <w:hyperlink r:id="rId25">
+        <w:r>
+          <w:rPr>
+            <w:rStyle w:val="Hyperlink"/>
+          </w:rPr>
+          <w:t xml:space="preserve">12</w:t>
+        </w:r>
+      </w:hyperlink>
+      <w:r>
+        <w:t xml:space="preserve">)</w:t>
       </w:r>
     </w:p>
     <w:tbl>
@@ -4640,6 +4662,238 @@
               <w:pStyle w:val="Compact"/>
             </w:pPr>
             <w:r>
+              <w:t xml:space="preserve">Yêu cầu</w:t>
+            </w:r>
+          </w:p>
+        </w:tc>
+        <w:tc>
+          <w:tcPr/>
+          <w:p>
+            <w:pPr>
+              <w:pStyle w:val="Compact"/>
+            </w:pPr>
+            <w:r>
+              <w:t xml:space="preserve">Tác nhân</w:t>
+            </w:r>
+          </w:p>
+        </w:tc>
+        <w:tc>
+          <w:tcPr/>
+          <w:p>
+            <w:pPr>
+              <w:pStyle w:val="Compact"/>
+            </w:pPr>
+            <w:r>
+              <w:t xml:space="preserve">Mức</w:t>
+            </w:r>
+          </w:p>
+        </w:tc>
+      </w:tr>
+      <w:tr>
+        <w:tc>
+          <w:tcPr/>
+          <w:p>
+            <w:pPr>
+              <w:pStyle w:val="Compact"/>
+            </w:pPr>
+            <w:r>
+              <w:t xml:space="preserve">FR-70</w:t>
+            </w:r>
+          </w:p>
+        </w:tc>
+        <w:tc>
+          <w:tcPr/>
+          <w:p>
+            <w:pPr>
+              <w:pStyle w:val="Compact"/>
+            </w:pPr>
+            <w:r>
+              <w:t xml:space="preserve">Tạo bài loại PAPER: các giai đoạn, khung mục mỗi giai đoạn (tiêu đề, bắt buộc, giới hạn từ), kiểu trích dẫn IEEE / APA, cỡ nhóm, hạn chốt nhóm; tiêu chí chấm thang 10</w:t>
+            </w:r>
+          </w:p>
+        </w:tc>
+        <w:tc>
+          <w:tcPr/>
+          <w:p>
+            <w:pPr>
+              <w:pStyle w:val="Compact"/>
+            </w:pPr>
+            <w:r>
+              <w:t xml:space="preserve">Giáo viên</w:t>
+            </w:r>
+          </w:p>
+        </w:tc>
+        <w:tc>
+          <w:tcPr/>
+          <w:p>
+            <w:pPr>
+              <w:pStyle w:val="Compact"/>
+            </w:pPr>
+            <w:r>
+              <w:t xml:space="preserve">4 ✅ B21a</w:t>
+            </w:r>
+          </w:p>
+        </w:tc>
+      </w:tr>
+      <w:tr>
+        <w:tc>
+          <w:tcPr/>
+          <w:p>
+            <w:pPr>
+              <w:pStyle w:val="Compact"/>
+            </w:pPr>
+            <w:r>
+              <w:t xml:space="preserve">FR-71</w:t>
+            </w:r>
+          </w:p>
+        </w:tc>
+        <w:tc>
+          <w:tcPr/>
+          <w:p>
+            <w:pPr>
+              <w:pStyle w:val="Compact"/>
+            </w:pPr>
+            <w:r>
+              <w:t xml:space="preserve">Lập nhóm: giáo viên tạo / sửa / xoá nhóm, chuyển sinh viên giữa nhóm, chia ngẫu nhiên theo lớp; sinh viên tự lập / vào / rời nhóm trước hạn chốt nhóm</w:t>
+            </w:r>
+          </w:p>
+        </w:tc>
+        <w:tc>
+          <w:tcPr/>
+          <w:p>
+            <w:pPr>
+              <w:pStyle w:val="Compact"/>
+            </w:pPr>
+            <w:r>
+              <w:t xml:space="preserve">Giáo viên, Sinh viên</w:t>
+            </w:r>
+          </w:p>
+        </w:tc>
+        <w:tc>
+          <w:tcPr/>
+          <w:p>
+            <w:pPr>
+              <w:pStyle w:val="Compact"/>
+            </w:pPr>
+            <w:r>
+              <w:t xml:space="preserve">4 ✅ B21a</w:t>
+            </w:r>
+          </w:p>
+        </w:tc>
+      </w:tr>
+      <w:tr>
+        <w:tc>
+          <w:tcPr/>
+          <w:p>
+            <w:pPr>
+              <w:pStyle w:val="Compact"/>
+            </w:pPr>
+            <w:r>
+              <w:t xml:space="preserve">FR-72 → FR-81</w:t>
+            </w:r>
+          </w:p>
+        </w:tc>
+        <w:tc>
+          <w:tcPr/>
+          <w:p>
+            <w:pPr>
+              <w:pStyle w:val="Compact"/>
+            </w:pPr>
+            <w:r>
+              <w:t xml:space="preserve">Trình soạn, đếm từ theo mục, trích dẫn, chấm rubric thang 10, cùng sửa realtime, đóng góp, xem trực tiếp, xuất file, đạo văn, AI — xem</w:t>
+            </w:r>
+            <w:r>
+              <w:t xml:space="preserve"> </w:t>
+            </w:r>
+            <w:hyperlink r:id="rId25">
+              <w:r>
+                <w:rPr>
+                  <w:rStyle w:val="Hyperlink"/>
+                </w:rPr>
+                <w:t xml:space="preserve">12</w:t>
+              </w:r>
+            </w:hyperlink>
+            <w:r>
+              <w:t xml:space="preserve"> </w:t>
+            </w:r>
+            <w:r>
+              <w:t xml:space="preserve">mục 2</w:t>
+            </w:r>
+          </w:p>
+        </w:tc>
+        <w:tc>
+          <w:tcPr/>
+          <w:p>
+            <w:pPr>
+              <w:pStyle w:val="Compact"/>
+            </w:pPr>
+          </w:p>
+        </w:tc>
+        <w:tc>
+          <w:tcPr/>
+          <w:p>
+            <w:pPr>
+              <w:pStyle w:val="Compact"/>
+            </w:pPr>
+            <w:r>
+              <w:t xml:space="preserve">4</w:t>
+            </w:r>
+          </w:p>
+        </w:tc>
+      </w:tr>
+    </w:tbl>
+    <w:p>
+      <w:r>
+        <w:pict>
+          <v:rect style="width:0;height:1.5pt" o:hralign="center" o:hrstd="t" o:hr="t"/>
+        </w:pict>
+      </w:r>
+    </w:p>
+    <w:bookmarkEnd w:id="26"/>
+    <w:bookmarkEnd w:id="27"/>
+    <w:bookmarkStart w:id="29" w:name="X4c3f3b6edb8f2a69d7cb2d70d01430b1d926638"/>
+    <w:p>
+      <w:pPr>
+        <w:pStyle w:val="Heading2"/>
+      </w:pPr>
+      <w:r>
+        <w:t xml:space="preserve">5. Yêu cầu phi chức năng</w:t>
+      </w:r>
+    </w:p>
+    <w:tbl>
+      <w:tblPr>
+        <w:tblStyle w:val="Table"/>
+        <w:tblW w:type="auto" w:w="0"/>
+        <w:tblLook w:firstRow="1" w:lastRow="0" w:firstColumn="0" w:lastColumn="0" w:noHBand="0" w:noVBand="0" w:val="0020"/>
+      </w:tblPr>
+      <w:tblGrid>
+        <w:gridCol w:w="1980"/>
+        <w:gridCol w:w="1980"/>
+        <w:gridCol w:w="1980"/>
+        <w:gridCol w:w="1980"/>
+      </w:tblGrid>
+      <w:tr>
+        <w:trPr>
+          <w:tblHeader w:val="on"/>
+        </w:trPr>
+        <w:tc>
+          <w:tcPr/>
+          <w:p>
+            <w:pPr>
+              <w:pStyle w:val="Compact"/>
+            </w:pPr>
+            <w:r>
+              <w:t xml:space="preserve">Mã</w:t>
+            </w:r>
+          </w:p>
+        </w:tc>
+        <w:tc>
+          <w:tcPr/>
+          <w:p>
+            <w:pPr>
+              <w:pStyle w:val="Compact"/>
+            </w:pPr>
+            <w:r>
               <w:t xml:space="preserve">Nhóm</w:t>
             </w:r>
           </w:p>
@@ -4738,7 +4992,7 @@
             <w:r>
               <w:t xml:space="preserve">— đạt, p95 9,9 ms, 0% lỗi (</w:t>
             </w:r>
-            <w:hyperlink r:id="rId26">
+            <w:hyperlink r:id="rId28">
               <w:r>
                 <w:rPr>
                   <w:rStyle w:val="Hyperlink"/>
@@ -4826,7 +5080,7 @@
             <w:r>
               <w:t xml:space="preserve">— đạt, 500 / 500 (</w:t>
             </w:r>
-            <w:hyperlink r:id="rId26">
+            <w:hyperlink r:id="rId28">
               <w:r>
                 <w:rPr>
                   <w:rStyle w:val="Hyperlink"/>
@@ -4923,7 +5177,7 @@
             <w:r>
               <w:t xml:space="preserve">— đạt, p95 228 ms (</w:t>
             </w:r>
-            <w:hyperlink r:id="rId26">
+            <w:hyperlink r:id="rId28">
               <w:r>
                 <w:rPr>
                   <w:rStyle w:val="Hyperlink"/>
@@ -5535,8 +5789,8 @@
         </w:pict>
       </w:r>
     </w:p>
-    <w:bookmarkEnd w:id="27"/>
-    <w:bookmarkStart w:id="29" w:name="Xc9033a980d0e4ab66189c83298bb25e4e69e79c"/>
+    <w:bookmarkEnd w:id="29"/>
+    <w:bookmarkStart w:id="31" w:name="Xc9033a980d0e4ab66189c83298bb25e4e69e79c"/>
     <w:p>
       <w:pPr>
         <w:pStyle w:val="Heading2"/>
@@ -6091,7 +6345,7 @@
             <w:r>
               <w:t xml:space="preserve"> </w:t>
             </w:r>
-            <w:hyperlink r:id="rId28">
+            <w:hyperlink r:id="rId30">
               <w:r>
                 <w:rPr>
                   <w:rStyle w:val="Hyperlink"/>
@@ -6478,6 +6732,336 @@
           </w:p>
         </w:tc>
       </w:tr>
+      <w:tr>
+        <w:tc>
+          <w:tcPr/>
+          <w:p>
+            <w:pPr>
+              <w:pStyle w:val="Compact"/>
+            </w:pPr>
+            <w:r>
+              <w:t xml:space="preserve">BR-23</w:t>
+            </w:r>
+          </w:p>
+        </w:tc>
+        <w:tc>
+          <w:tcPr/>
+          <w:p>
+            <w:pPr>
+              <w:pStyle w:val="Compact"/>
+            </w:pPr>
+            <w:r>
+              <w:t xml:space="preserve">(Mức 3) Phần bật</w:t>
+            </w:r>
+            <w:r>
+              <w:t xml:space="preserve"> </w:t>
+            </w:r>
+            <w:r>
+              <w:rPr>
+                <w:b/>
+                <w:bCs/>
+              </w:rPr>
+              <w:t xml:space="preserve">chế độ thi</w:t>
+            </w:r>
+            <w:r>
+              <w:t xml:space="preserve"> </w:t>
+            </w:r>
+            <w:r>
+              <w:t xml:space="preserve">chỉ soạn / nộp được sau khi bấm "Bắt đầu". Mỗi sinh viên thi một phần đúng một lần: giờ kết thúc = lúc bắt đầu + thời lượng, cố định theo giờ server; tải lại trang, mở tab khác không đặt lại đồng hồ.</w:t>
+            </w:r>
+          </w:p>
+        </w:tc>
+      </w:tr>
+      <w:tr>
+        <w:tc>
+          <w:tcPr/>
+          <w:p>
+            <w:pPr>
+              <w:pStyle w:val="Compact"/>
+            </w:pPr>
+            <w:r>
+              <w:t xml:space="preserve">BR-24</w:t>
+            </w:r>
+          </w:p>
+        </w:tc>
+        <w:tc>
+          <w:tcPr/>
+          <w:p>
+            <w:pPr>
+              <w:pStyle w:val="Compact"/>
+            </w:pPr>
+            <w:r>
+              <w:t xml:space="preserve">(Mức 3) Hết giờ thi</w:t>
+            </w:r>
+            <w:r>
+              <w:t xml:space="preserve"> </w:t>
+            </w:r>
+            <w:r>
+              <w:rPr>
+                <w:b/>
+                <w:bCs/>
+              </w:rPr>
+              <w:t xml:space="preserve">không tự nộp</w:t>
+            </w:r>
+            <w:r>
+              <w:t xml:space="preserve">: sinh viên vẫn viết và nộp được, nhưng phiên bị gắn "Quá thời gian". Lúc hết giờ mà chưa nộp, hệ thống báo giáo viên và sinh viên đúng một lần.</w:t>
+            </w:r>
+          </w:p>
+        </w:tc>
+      </w:tr>
+      <w:tr>
+        <w:tc>
+          <w:tcPr/>
+          <w:p>
+            <w:pPr>
+              <w:pStyle w:val="Compact"/>
+            </w:pPr>
+            <w:r>
+              <w:t xml:space="preserve">BR-26</w:t>
+            </w:r>
+          </w:p>
+        </w:tc>
+        <w:tc>
+          <w:tcPr/>
+          <w:p>
+            <w:pPr>
+              <w:pStyle w:val="Compact"/>
+            </w:pPr>
+            <w:r>
+              <w:t xml:space="preserve">(Mức 3) Giáo viên chủ bài</w:t>
+            </w:r>
+            <w:r>
+              <w:t xml:space="preserve"> </w:t>
+            </w:r>
+            <w:r>
+              <w:rPr>
+                <w:b/>
+                <w:bCs/>
+              </w:rPr>
+              <w:t xml:space="preserve">xem trực tiếp</w:t>
+            </w:r>
+            <w:r>
+              <w:t xml:space="preserve"> </w:t>
+            </w:r>
+            <w:r>
+              <w:t xml:space="preserve">nội dung sinh viên đang gõ (kể cả nháp chưa nộp) khi phần còn đang làm, và</w:t>
+            </w:r>
+            <w:r>
+              <w:t xml:space="preserve"> </w:t>
+            </w:r>
+            <w:r>
+              <w:rPr>
+                <w:b/>
+                <w:bCs/>
+              </w:rPr>
+              <w:t xml:space="preserve">bình luận trực tiếp</w:t>
+            </w:r>
+            <w:r>
+              <w:t xml:space="preserve"> </w:t>
+            </w:r>
+            <w:r>
+              <w:t xml:space="preserve">qua kênh chat của bài nộp. Nội dung đang gõ chỉ giữ trong bộ nhớ server, không lưu thêm; đã nộp thì dừng xem trực tiếp. Đây là ngoại lệ có chủ đích của quy tắc "giáo viên chỉ đọc bài đã nộp".</w:t>
+            </w:r>
+          </w:p>
+        </w:tc>
+      </w:tr>
+      <w:tr>
+        <w:tc>
+          <w:tcPr/>
+          <w:p>
+            <w:pPr>
+              <w:pStyle w:val="Compact"/>
+            </w:pPr>
+            <w:r>
+              <w:t xml:space="preserve">BR-27</w:t>
+            </w:r>
+          </w:p>
+        </w:tc>
+        <w:tc>
+          <w:tcPr/>
+          <w:p>
+            <w:pPr>
+              <w:pStyle w:val="Compact"/>
+            </w:pPr>
+            <w:r>
+              <w:t xml:space="preserve">(Mức 4) Bài PAPER làm theo nhóm. Mỗi sinh viên thuộc</w:t>
+            </w:r>
+            <w:r>
+              <w:t xml:space="preserve"> </w:t>
+            </w:r>
+            <w:r>
+              <w:rPr>
+                <w:b/>
+                <w:bCs/>
+              </w:rPr>
+              <w:t xml:space="preserve">tối đa một nhóm</w:t>
+            </w:r>
+            <w:r>
+              <w:t xml:space="preserve"> </w:t>
+            </w:r>
+            <w:r>
+              <w:t xml:space="preserve">trong một bài (UNIQUE trong DB); nhóm không vượt cỡ tối đa (1–10, mặc định 4). Trước</w:t>
+            </w:r>
+            <w:r>
+              <w:t xml:space="preserve"> </w:t>
+            </w:r>
+            <w:r>
+              <w:rPr>
+                <w:b/>
+                <w:bCs/>
+              </w:rPr>
+              <w:t xml:space="preserve">hạn chốt nhóm</w:t>
+            </w:r>
+            <w:r>
+              <w:t xml:space="preserve"> </w:t>
+            </w:r>
+            <w:r>
+              <w:t xml:space="preserve">(không đặt = hạn nộp) sinh viên tự lập / vào / rời nhóm; sau đó chỉ giáo viên đổi được. Giáo viên xếp một sinh viên vào nhóm thì người đó tự rời nhóm cũ; nhóm sinh viên tự lập không còn ai thì tự xoá.</w:t>
+            </w:r>
+          </w:p>
+        </w:tc>
+      </w:tr>
+      <w:tr>
+        <w:tc>
+          <w:tcPr/>
+          <w:p>
+            <w:pPr>
+              <w:pStyle w:val="Compact"/>
+            </w:pPr>
+            <w:r>
+              <w:t xml:space="preserve">BR-28</w:t>
+            </w:r>
+          </w:p>
+        </w:tc>
+        <w:tc>
+          <w:tcPr/>
+          <w:p>
+            <w:pPr>
+              <w:pStyle w:val="Compact"/>
+            </w:pPr>
+            <w:r>
+              <w:t xml:space="preserve">(Mức 4) Bài làm của bài PAPER thuộc</w:t>
+            </w:r>
+            <w:r>
+              <w:t xml:space="preserve"> </w:t>
+            </w:r>
+            <w:r>
+              <w:rPr>
+                <w:b/>
+                <w:bCs/>
+              </w:rPr>
+              <w:t xml:space="preserve">nhóm</w:t>
+            </w:r>
+            <w:r>
+              <w:t xml:space="preserve">: một bài làm cho mỗi (giai đoạn, nhóm). Mọi thành viên hiện tại cùng thấy và sửa một bản nháp (khoá lạc quan chung), bất kỳ ai cũng nộp được (ghi người nộp gần nhất); kết quả chấm, yêu cầu sửa, thông báo, nhắc hạn, kênh chat bài nộp áp dụng cho cả nhóm. Chưa có nhóm thì chưa soạn / nộp được. Nhóm đã có bài làm thì sinh viên không tự rời và giáo viên không xoá nhóm.</w:t>
+            </w:r>
+          </w:p>
+        </w:tc>
+      </w:tr>
+      <w:tr>
+        <w:tc>
+          <w:tcPr/>
+          <w:p>
+            <w:pPr>
+              <w:pStyle w:val="Compact"/>
+            </w:pPr>
+            <w:r>
+              <w:t xml:space="preserve">BR-29</w:t>
+            </w:r>
+          </w:p>
+        </w:tc>
+        <w:tc>
+          <w:tcPr/>
+          <w:p>
+            <w:pPr>
+              <w:pStyle w:val="Compact"/>
+            </w:pPr>
+            <w:r>
+              <w:t xml:space="preserve">(Mức 4) Mỗi giai đoạn của bài PAPER có</w:t>
+            </w:r>
+            <w:r>
+              <w:t xml:space="preserve"> </w:t>
+            </w:r>
+            <w:r>
+              <w:rPr>
+                <w:b/>
+                <w:bCs/>
+              </w:rPr>
+              <w:t xml:space="preserve">khung mục</w:t>
+            </w:r>
+            <w:r>
+              <w:t xml:space="preserve"> </w:t>
+            </w:r>
+            <w:r>
+              <w:t xml:space="preserve">do giáo viên đặt (tiêu đề, bắt buộc hay không, số từ tối thiểu / tối đa); mã mục sinh từ tiêu đề, không trùng trong một phần. Phát hành cần mọi giai đoạn có ít nhất một mục. Mục bắt buộc phải có nội dung mới nộp được (kiểm ở B25); giới hạn số từ chỉ cảnh báo.</w:t>
+            </w:r>
+          </w:p>
+        </w:tc>
+      </w:tr>
+      <w:tr>
+        <w:tc>
+          <w:tcPr/>
+          <w:p>
+            <w:pPr>
+              <w:pStyle w:val="Compact"/>
+            </w:pPr>
+            <w:r>
+              <w:t xml:space="preserve">BR-31</w:t>
+            </w:r>
+          </w:p>
+        </w:tc>
+        <w:tc>
+          <w:tcPr/>
+          <w:p>
+            <w:pPr>
+              <w:pStyle w:val="Compact"/>
+            </w:pPr>
+            <w:r>
+              <w:t xml:space="preserve">(Mức 4) Tiêu chí của bài PAPER chấm</w:t>
+            </w:r>
+            <w:r>
+              <w:t xml:space="preserve"> </w:t>
+            </w:r>
+            <w:r>
+              <w:rPr>
+                <w:b/>
+                <w:bCs/>
+              </w:rPr>
+              <w:t xml:space="preserve">thang 10</w:t>
+            </w:r>
+            <w:r>
+              <w:t xml:space="preserve"> </w:t>
+            </w:r>
+            <w:r>
+              <w:t xml:space="preserve">(mặc định điểm tối đa 10, bước 0,25; được chọn bước 1 / 0,5 / 0,25); bài luận IELTS giữ band 0–9, bước 1 / 0,5. Rubric phân tích (mức đạt có mô tả) và cách tính điểm cả bài làm ở B25.</w:t>
+            </w:r>
+          </w:p>
+        </w:tc>
+      </w:tr>
+      <w:tr>
+        <w:tc>
+          <w:tcPr/>
+          <w:p>
+            <w:pPr>
+              <w:pStyle w:val="Compact"/>
+            </w:pPr>
+            <w:r>
+              <w:t xml:space="preserve">BR-25</w:t>
+            </w:r>
+          </w:p>
+        </w:tc>
+        <w:tc>
+          <w:tcPr/>
+          <w:p>
+            <w:pPr>
+              <w:pStyle w:val="Compact"/>
+            </w:pPr>
+            <w:r>
+              <w:t xml:space="preserve">(Mức 3) Trong phiên thi, rời trang làm bài (chuyển tab / thu nhỏ), rời cửa sổ làm bài mà tab vẫn hiện (Alt+Tab sang ứng dụng khác, màn hình thứ 2), dán văn bản, mất và có lại kết nối đều được ghi lại; sự kiện xảy ra lúc mất mạng được máy sinh viên giữ lại và gửi bù khi có mạng, ghi đúng giờ xảy ra kèm dấu "gửi bù" (kèm số ký tự dán, không lưu nội dung dán) và hiện ngay trên màn giám sát của giáo viên. Rời trang / cửa sổ và dán còn tạo thông báo cho giáo viên, tối đa một lần / 2 phút cho mỗi phiên.</w:t>
+            </w:r>
+          </w:p>
+        </w:tc>
+      </w:tr>
     </w:tbl>
     <w:p>
       <w:r>
@@ -6486,8 +7070,8 @@
         </w:pict>
       </w:r>
     </w:p>
-    <w:bookmarkEnd w:id="29"/>
-    <w:bookmarkStart w:id="35" w:name="X271c70a0668e3cc8ca8b62669a7dc58412e05c6"/>
+    <w:bookmarkEnd w:id="31"/>
+    <w:bookmarkStart w:id="37" w:name="X271c70a0668e3cc8ca8b62669a7dc58412e05c6"/>
     <w:p>
       <w:pPr>
         <w:pStyle w:val="Heading2"/>
@@ -6505,18 +7089,18 @@
           <wp:inline>
             <wp:extent cx="5334000" cy="3286125"/>
             <wp:effectExtent b="0" l="0" r="0" t="0"/>
-            <wp:docPr descr="Hình 01.1" title="" id="31" name="Picture"/>
+            <wp:docPr descr="Hình 01.1" title="" id="33" name="Picture"/>
             <a:graphic>
               <a:graphicData uri="http://schemas.openxmlformats.org/drawingml/2006/picture">
                 <pic:pic>
                   <pic:nvPicPr>
-                    <pic:cNvPr descr="D:/LTMTU/docx/hinh/01-tong-quan-hinh-1.png" id="32" name="Picture"/>
+                    <pic:cNvPr descr="D:/LTMTU/docx/hinh/01-tong-quan-hinh-1.png" id="34" name="Picture"/>
                     <pic:cNvPicPr>
                       <a:picLocks noChangeArrowheads="1" noChangeAspect="1"/>
                     </pic:cNvPicPr>
                   </pic:nvPicPr>
                   <pic:blipFill>
-                    <a:blip r:embed="rId30"/>
+                    <a:blip r:embed="rId32"/>
                     <a:stretch>
                       <a:fillRect/>
                     </a:stretch>
@@ -6877,7 +7461,7 @@
       <w:r>
         <w:t xml:space="preserve"> </w:t>
       </w:r>
-      <w:hyperlink r:id="rId33">
+      <w:hyperlink r:id="rId35">
         <w:r>
           <w:rPr>
             <w:rStyle w:val="VerbatimChar"/>
@@ -6915,7 +7499,7 @@
       <w:r>
         <w:t xml:space="preserve"> </w:t>
       </w:r>
-      <w:hyperlink r:id="rId34">
+      <w:hyperlink r:id="rId36">
         <w:r>
           <w:rPr>
             <w:rStyle w:val="VerbatimChar"/>
@@ -6944,7 +7528,7 @@
       <w:r>
         <w:t xml:space="preserve"> </w:t>
       </w:r>
-      <w:hyperlink r:id="rId26">
+      <w:hyperlink r:id="rId28">
         <w:r>
           <w:rPr>
             <w:rStyle w:val="Hyperlink"/>
@@ -6963,8 +7547,8 @@
         </w:pict>
       </w:r>
     </w:p>
-    <w:bookmarkEnd w:id="35"/>
-    <w:bookmarkStart w:id="36" w:name="Xfe32609f4716a5a0e160829cacc783e5631e738"/>
+    <w:bookmarkEnd w:id="37"/>
+    <w:bookmarkStart w:id="38" w:name="Xfe32609f4716a5a0e160829cacc783e5631e738"/>
     <w:p>
       <w:pPr>
         <w:pStyle w:val="Heading2"/>
@@ -7228,8 +7812,8 @@
         </w:pict>
       </w:r>
     </w:p>
-    <w:bookmarkEnd w:id="36"/>
-    <w:bookmarkStart w:id="37" w:name="X0e7478702f5df70d76349c9562db5ccd7409e48"/>
+    <w:bookmarkEnd w:id="38"/>
+    <w:bookmarkStart w:id="39" w:name="X0e7478702f5df70d76349c9562db5ccd7409e48"/>
     <w:p>
       <w:pPr>
         <w:pStyle w:val="Heading2"/>
@@ -7684,8 +8268,8 @@
         </w:tc>
       </w:tr>
     </w:tbl>
-    <w:bookmarkEnd w:id="37"/>
-    <w:bookmarkEnd w:id="38"/>
+    <w:bookmarkEnd w:id="39"/>
+    <w:bookmarkEnd w:id="40"/>
     <w:sectPr>
       <w:footnotePr>
         <w:numRestart w:val="eachSect"/>

</xml_diff>

<commit_message>
Module viết bài và nộp bài: nộp bằng snapshot cho bài Paper, chặn nộp bản cũ (409 SNAPSHOT_STALE)
</commit_message>
<xml_diff>
--- a/docx/01-tong-quan.docx
+++ b/docx/01-tong-quan.docx
@@ -94,7 +94,7 @@
         </w:pict>
       </w:r>
     </w:p>
-    <w:bookmarkStart w:id="12" w:name="X1a215e5357503c0278204a635df378e131d4fb5"/>
+    <w:bookmarkStart w:id="13" w:name="X1a215e5357503c0278204a635df378e131d4fb5"/>
     <w:p>
       <w:pPr>
         <w:pStyle w:val="Heading2"/>
@@ -181,7 +181,7 @@
       </w:r>
     </w:p>
     <w:bookmarkEnd w:id="9"/>
-    <w:bookmarkStart w:id="10" w:name="X31aa4da80ab23a499e8cba079f2158cfef5b120"/>
+    <w:bookmarkStart w:id="11" w:name="X31aa4da80ab23a499e8cba079f2158cfef5b120"/>
     <w:p>
       <w:pPr>
         <w:pStyle w:val="Heading3"/>
@@ -195,7 +195,33 @@
         <w:pStyle w:val="FirstParagraph"/>
       </w:pPr>
       <w:r>
-        <w:t xml:space="preserve">Xây dựng website giúp giáo viên</w:t>
+        <w:t xml:space="preserve">Xây dựng website</w:t>
+      </w:r>
+      <w:r>
+        <w:t xml:space="preserve"> </w:t>
+      </w:r>
+      <w:r>
+        <w:rPr>
+          <w:b/>
+          <w:bCs/>
+        </w:rPr>
+        <w:t xml:space="preserve">AcaWrite</w:t>
+      </w:r>
+      <w:r>
+        <w:t xml:space="preserve"> </w:t>
+      </w:r>
+      <w:r>
+        <w:t xml:space="preserve">(</w:t>
+      </w:r>
+      <w:r>
+        <w:rPr>
+          <w:i/>
+          <w:iCs/>
+        </w:rPr>
+        <w:t xml:space="preserve">Academic Writing</w:t>
+      </w:r>
+      <w:r>
+        <w:t xml:space="preserve">) giúp giáo viên</w:t>
       </w:r>
       <w:r>
         <w:t xml:space="preserve"> </w:t>
@@ -208,7 +234,24 @@
         <w:t xml:space="preserve">giao bài và chấm bài IELTS Writing trực tuyến</w:t>
       </w:r>
       <w:r>
-        <w:t xml:space="preserve">:</w:t>
+        <w:t xml:space="preserve"> </w:t>
+      </w:r>
+      <w:r>
+        <w:t xml:space="preserve">(từ Mức 4 có thêm paper học thuật viết theo nhóm, xem</w:t>
+      </w:r>
+      <w:r>
+        <w:t xml:space="preserve"> </w:t>
+      </w:r>
+      <w:hyperlink r:id="rId10">
+        <w:r>
+          <w:rPr>
+            <w:rStyle w:val="Hyperlink"/>
+          </w:rPr>
+          <w:t xml:space="preserve">docs/12</w:t>
+        </w:r>
+      </w:hyperlink>
+      <w:r>
+        <w:t xml:space="preserve">):</w:t>
       </w:r>
     </w:p>
     <w:p>
@@ -500,8 +543,8 @@
         <w:t xml:space="preserve">kết quả học tập.</w:t>
       </w:r>
     </w:p>
-    <w:bookmarkEnd w:id="10"/>
-    <w:bookmarkStart w:id="11" w:name="X303f2ceba2a3aa79f4d1b982108b0954e4b7142"/>
+    <w:bookmarkEnd w:id="11"/>
+    <w:bookmarkStart w:id="12" w:name="X303f2ceba2a3aa79f4d1b982108b0954e4b7142"/>
     <w:p>
       <w:pPr>
         <w:pStyle w:val="Heading3"/>
@@ -683,9 +726,9 @@
         </w:pict>
       </w:r>
     </w:p>
-    <w:bookmarkEnd w:id="11"/>
     <w:bookmarkEnd w:id="12"/>
-    <w:bookmarkStart w:id="15" w:name="Xb01bcb1f0f6df7992b998ec1d509ddaa1e67765"/>
+    <w:bookmarkEnd w:id="13"/>
+    <w:bookmarkStart w:id="16" w:name="Xb01bcb1f0f6df7992b998ec1d509ddaa1e67765"/>
     <w:p>
       <w:pPr>
         <w:pStyle w:val="Heading2"/>
@@ -694,7 +737,7 @@
         <w:t xml:space="preserve">2. Phạm vi</w:t>
       </w:r>
     </w:p>
-    <w:bookmarkStart w:id="13" w:name="Xc44b7b397db222405ac9da4a026aa492be35491"/>
+    <w:bookmarkStart w:id="14" w:name="Xc44b7b397db222405ac9da4a026aa492be35491"/>
     <w:p>
       <w:pPr>
         <w:pStyle w:val="Heading3"/>
@@ -767,8 +810,8 @@
         <w:t xml:space="preserve">Triển khai bằng Docker trên một máy chủ hoặc trong mạng LAN.</w:t>
       </w:r>
     </w:p>
-    <w:bookmarkEnd w:id="13"/>
-    <w:bookmarkStart w:id="14" w:name="X8402e01bd20038e9a04b08b205a47647ca584bf"/>
+    <w:bookmarkEnd w:id="14"/>
+    <w:bookmarkStart w:id="15" w:name="X8402e01bd20038e9a04b08b205a47647ca584bf"/>
     <w:p>
       <w:pPr>
         <w:pStyle w:val="Heading3"/>
@@ -860,9 +903,9 @@
         </w:pict>
       </w:r>
     </w:p>
-    <w:bookmarkEnd w:id="14"/>
     <w:bookmarkEnd w:id="15"/>
-    <w:bookmarkStart w:id="16" w:name="X0d762d68ce7564a32358869a631f87c73441009"/>
+    <w:bookmarkEnd w:id="16"/>
+    <w:bookmarkStart w:id="17" w:name="X0d762d68ce7564a32358869a631f87c73441009"/>
     <w:p>
       <w:pPr>
         <w:pStyle w:val="Heading2"/>
@@ -1207,7 +1250,7 @@
         </w:pict>
       </w:r>
     </w:p>
-    <w:bookmarkEnd w:id="16"/>
+    <w:bookmarkEnd w:id="17"/>
     <w:bookmarkStart w:id="27" w:name="Xea9ee2abb1d9c3f9610db3a634986f9b148ce56"/>
     <w:p>
       <w:pPr>
@@ -1243,7 +1286,7 @@
       <w:r>
         <w:t xml:space="preserve"> </w:t>
       </w:r>
-      <w:hyperlink r:id="rId17">
+      <w:hyperlink r:id="rId18">
         <w:r>
           <w:rPr>
             <w:rStyle w:val="Hyperlink"/>
@@ -1255,7 +1298,7 @@
         <w:t xml:space="preserve">: Mức 1 là lõi nghiệp vụ, Mức 2 là trọng tâm mạng, Mức 3 là mở rộng.</w:t>
       </w:r>
     </w:p>
-    <w:bookmarkStart w:id="18" w:name="X5bf4dc675bfb4f018279e7e07ef42b7f5ba3d40"/>
+    <w:bookmarkStart w:id="19" w:name="X5bf4dc675bfb4f018279e7e07ef42b7f5ba3d40"/>
     <w:p>
       <w:pPr>
         <w:pStyle w:val="Heading3"/>
@@ -1694,8 +1737,8 @@
         </w:tc>
       </w:tr>
     </w:tbl>
-    <w:bookmarkEnd w:id="18"/>
-    <w:bookmarkStart w:id="19" w:name="Xaa7b38847c0b60bc3e4d287fc14c8273abadce0"/>
+    <w:bookmarkEnd w:id="19"/>
+    <w:bookmarkStart w:id="20" w:name="Xaa7b38847c0b60bc3e4d287fc14c8273abadce0"/>
     <w:p>
       <w:pPr>
         <w:pStyle w:val="Heading3"/>
@@ -2213,8 +2256,8 @@
         </w:tc>
       </w:tr>
     </w:tbl>
-    <w:bookmarkEnd w:id="19"/>
-    <w:bookmarkStart w:id="20" w:name="Xa5aff3e76cd650ba26ab4fef4585b449114b882"/>
+    <w:bookmarkEnd w:id="20"/>
+    <w:bookmarkStart w:id="21" w:name="Xa5aff3e76cd650ba26ab4fef4585b449114b882"/>
     <w:p>
       <w:pPr>
         <w:pStyle w:val="Heading3"/>
@@ -2678,8 +2721,8 @@
         </w:tc>
       </w:tr>
     </w:tbl>
-    <w:bookmarkEnd w:id="20"/>
-    <w:bookmarkStart w:id="21" w:name="X686e72468777619a994a88b57617c3c67ca52e7"/>
+    <w:bookmarkEnd w:id="21"/>
+    <w:bookmarkStart w:id="22" w:name="X686e72468777619a994a88b57617c3c67ca52e7"/>
     <w:p>
       <w:pPr>
         <w:pStyle w:val="Heading3"/>
@@ -3089,8 +3132,8 @@
         </w:tc>
       </w:tr>
     </w:tbl>
-    <w:bookmarkEnd w:id="21"/>
-    <w:bookmarkStart w:id="22" w:name="Xa5be82dda987150604110ffdb6e7276db53e2b2"/>
+    <w:bookmarkEnd w:id="22"/>
+    <w:bookmarkStart w:id="23" w:name="Xa5be82dda987150604110ffdb6e7276db53e2b2"/>
     <w:p>
       <w:pPr>
         <w:pStyle w:val="Heading3"/>
@@ -3754,8 +3797,8 @@
         </w:tc>
       </w:tr>
     </w:tbl>
-    <w:bookmarkEnd w:id="22"/>
-    <w:bookmarkStart w:id="23" w:name="Xef9e8f7b1abe6bd4ef85e8a75cf5c36f93a4a4f"/>
+    <w:bookmarkEnd w:id="23"/>
+    <w:bookmarkStart w:id="24" w:name="Xef9e8f7b1abe6bd4ef85e8a75cf5c36f93a4a4f"/>
     <w:p>
       <w:pPr>
         <w:pStyle w:val="Heading3"/>
@@ -4148,8 +4191,8 @@
         </w:tc>
       </w:tr>
     </w:tbl>
-    <w:bookmarkEnd w:id="23"/>
-    <w:bookmarkStart w:id="24" w:name="Xcdacf7e5872d017e756191b5fb45bb7bbcae074"/>
+    <w:bookmarkEnd w:id="24"/>
+    <w:bookmarkStart w:id="25" w:name="Xcdacf7e5872d017e756191b5fb45bb7bbcae074"/>
     <w:p>
       <w:pPr>
         <w:pStyle w:val="Heading3"/>
@@ -4604,7 +4647,7 @@
         </w:tc>
       </w:tr>
     </w:tbl>
-    <w:bookmarkEnd w:id="24"/>
+    <w:bookmarkEnd w:id="25"/>
     <w:bookmarkStart w:id="26" w:name="Xb667374215cf5e933e1df4d05020639d0e97fcd"/>
     <w:p>
       <w:pPr>
@@ -4616,7 +4659,7 @@
       <w:r>
         <w:t xml:space="preserve"> </w:t>
       </w:r>
-      <w:hyperlink r:id="rId25">
+      <w:hyperlink r:id="rId10">
         <w:r>
           <w:rPr>
             <w:rStyle w:val="Hyperlink"/>
@@ -4805,7 +4848,7 @@
             <w:r>
               <w:t xml:space="preserve"> </w:t>
             </w:r>
-            <w:hyperlink r:id="rId25">
+            <w:hyperlink r:id="rId10">
               <w:r>
                 <w:rPr>
                   <w:rStyle w:val="Hyperlink"/>

</xml_diff>